<commit_message>
docs(lab3): fix requested evidence figures
</commit_message>
<xml_diff>
--- a/实验三_DevOps流水线与容器化部署/D3-6_可观测性配置与Dashboard截图.docx
+++ b/实验三_DevOps流水线与容器化部署/D3-6_可观测性配置与Dashboard截图.docx
@@ -620,8 +620,8 @@
             <w:r>
               <w:drawing>
                 <wp:inline xmlns:a="http://schemas.openxmlformats.org/drawingml/2006/main" xmlns:pic="http://schemas.openxmlformats.org/drawingml/2006/picture">
-                  <wp:extent cx="4983480" cy="2958941"/>
-                  <wp:docPr id="1" name="Picture 1"/>
+                  <wp:extent cx="5760720" cy="3170100"/>
+                  <wp:docPr id="12" name="Picture 12"/>
                   <wp:cNvGraphicFramePr>
                     <a:graphicFrameLocks noChangeAspect="1"/>
                   </wp:cNvGraphicFramePr>
@@ -629,11 +629,11 @@
                     <a:graphicData uri="http://schemas.openxmlformats.org/drawingml/2006/picture">
                       <pic:pic>
                         <pic:nvPicPr>
-                          <pic:cNvPr id="0" name="image.png"/>
+                          <pic:cNvPr id="0" name="lab3_observability_pipeline.png"/>
                           <pic:cNvPicPr/>
                         </pic:nvPicPr>
                         <pic:blipFill>
-                          <a:blip r:embed="rId9"/>
+                          <a:blip r:embed="rId20"/>
                           <a:stretch>
                             <a:fillRect/>
                           </a:stretch>
@@ -641,7 +641,7 @@
                         <pic:spPr>
                           <a:xfrm>
                             <a:off x="0" y="0"/>
-                            <a:ext cx="4983480" cy="2958941"/>
+                            <a:ext cx="5760720" cy="3170100"/>
                           </a:xfrm>
                           <a:prstGeom prst="rect"/>
                         </pic:spPr>
@@ -657,6 +657,9 @@
               <w:jc w:val="center"/>
             </w:pPr>
             <w:r>
+              <w:rPr>
+                <w:i/>
+              </w:rPr>
               <w:t>图3-4 可观测性采集链路总览</w:t>
             </w:r>
           </w:p>
@@ -1228,9 +1231,9 @@
           <w:p>
             <w:r>
               <w:rPr>
-                <w:b w:val="0"/>
+                <w:i w:val="0"/>
               </w:rPr>
-              <w:t>截图要求：本节至少提交 4 张 Grafana Dashboard 实机截图，建议分别覆盖 RED 总览、延迟/错误、资源 USE、发布窗口/回滚标记。下列为基于本仓库 Grafana 配置绘制的示例图，提交前按说明替换为 http://localhost:3001 实机截图。</w:t>
+              <w:t>截图要求：本节至少提交 4 张 Grafana Dashboard 实机截图，建议分别覆盖 RED 总览、延迟/错误、资源 USE、发布窗口/回滚标记。下图为 http://localhost:3001 的完整 Dashboard 实机截图，已在同一页面覆盖 QPS、请求延迟、错误率和目标健康等面板。</w:t>
             </w:r>
           </w:p>
           <w:p>
@@ -1240,8 +1243,8 @@
             <w:r>
               <w:drawing>
                 <wp:inline xmlns:a="http://schemas.openxmlformats.org/drawingml/2006/main" xmlns:pic="http://schemas.openxmlformats.org/drawingml/2006/picture">
-                  <wp:extent cx="5715000" cy="2361890"/>
-                  <wp:docPr id="6" name="Picture 6"/>
+                  <wp:extent cx="5760720" cy="3103317"/>
+                  <wp:docPr id="13" name="Picture 13"/>
                   <wp:cNvGraphicFramePr>
                     <a:graphicFrameLocks noChangeAspect="1"/>
                   </wp:cNvGraphicFramePr>
@@ -1249,11 +1252,11 @@
                     <a:graphicData uri="http://schemas.openxmlformats.org/drawingml/2006/picture">
                       <pic:pic>
                         <pic:nvPicPr>
-                          <pic:cNvPr id="0" name="D3-6_Dashboard_01_QPS.png"/>
+                          <pic:cNvPr id="0" name="image.png"/>
                           <pic:cNvPicPr/>
                         </pic:nvPicPr>
                         <pic:blipFill>
-                          <a:blip r:embed="rId14"/>
+                          <a:blip r:embed="rId19"/>
                           <a:stretch>
                             <a:fillRect/>
                           </a:stretch>
@@ -1261,7 +1264,7 @@
                         <pic:spPr>
                           <a:xfrm>
                             <a:off x="0" y="0"/>
-                            <a:ext cx="5715000" cy="2361890"/>
+                            <a:ext cx="5760720" cy="3103317"/>
                           </a:xfrm>
                           <a:prstGeom prst="rect"/>
                         </pic:spPr>
@@ -1280,157 +1283,7 @@
               <w:rPr>
                 <w:i/>
               </w:rPr>
-              <w:t>图3-5a Dashboard 截图：QPS / RED 总览（实机截图）</w:t>
-            </w:r>
-          </w:p>
-          <w:p>
-            <w:pPr>
-              <w:jc w:val="center"/>
-            </w:pPr>
-            <w:r>
-              <w:drawing>
-                <wp:inline xmlns:a="http://schemas.openxmlformats.org/drawingml/2006/main" xmlns:pic="http://schemas.openxmlformats.org/drawingml/2006/picture">
-                  <wp:extent cx="5715000" cy="2358694"/>
-                  <wp:docPr id="7" name="Picture 7"/>
-                  <wp:cNvGraphicFramePr>
-                    <a:graphicFrameLocks noChangeAspect="1"/>
-                  </wp:cNvGraphicFramePr>
-                  <a:graphic>
-                    <a:graphicData uri="http://schemas.openxmlformats.org/drawingml/2006/picture">
-                      <pic:pic>
-                        <pic:nvPicPr>
-                          <pic:cNvPr id="0" name="D3-6_Dashboard_02_Latency.png"/>
-                          <pic:cNvPicPr/>
-                        </pic:nvPicPr>
-                        <pic:blipFill>
-                          <a:blip r:embed="rId15"/>
-                          <a:stretch>
-                            <a:fillRect/>
-                          </a:stretch>
-                        </pic:blipFill>
-                        <pic:spPr>
-                          <a:xfrm>
-                            <a:off x="0" y="0"/>
-                            <a:ext cx="5715000" cy="2358694"/>
-                          </a:xfrm>
-                          <a:prstGeom prst="rect"/>
-                        </pic:spPr>
-                      </pic:pic>
-                    </a:graphicData>
-                  </a:graphic>
-                </wp:inline>
-              </w:drawing>
-            </w:r>
-          </w:p>
-          <w:p>
-            <w:pPr>
-              <w:jc w:val="center"/>
-            </w:pPr>
-            <w:r>
-              <w:rPr>
-                <w:i/>
-              </w:rPr>
-              <w:t>图3-5b Dashboard 截图：请求延迟趋势（实机截图）</w:t>
-            </w:r>
-          </w:p>
-          <w:p>
-            <w:pPr>
-              <w:jc w:val="center"/>
-            </w:pPr>
-            <w:r>
-              <w:drawing>
-                <wp:inline xmlns:a="http://schemas.openxmlformats.org/drawingml/2006/main" xmlns:pic="http://schemas.openxmlformats.org/drawingml/2006/picture">
-                  <wp:extent cx="5715000" cy="2361890"/>
-                  <wp:docPr id="8" name="Picture 8"/>
-                  <wp:cNvGraphicFramePr>
-                    <a:graphicFrameLocks noChangeAspect="1"/>
-                  </wp:cNvGraphicFramePr>
-                  <a:graphic>
-                    <a:graphicData uri="http://schemas.openxmlformats.org/drawingml/2006/picture">
-                      <pic:pic>
-                        <pic:nvPicPr>
-                          <pic:cNvPr id="0" name="D3-6_Dashboard_03_ErrorRate.png"/>
-                          <pic:cNvPicPr/>
-                        </pic:nvPicPr>
-                        <pic:blipFill>
-                          <a:blip r:embed="rId16"/>
-                          <a:stretch>
-                            <a:fillRect/>
-                          </a:stretch>
-                        </pic:blipFill>
-                        <pic:spPr>
-                          <a:xfrm>
-                            <a:off x="0" y="0"/>
-                            <a:ext cx="5715000" cy="2361890"/>
-                          </a:xfrm>
-                          <a:prstGeom prst="rect"/>
-                        </pic:spPr>
-                      </pic:pic>
-                    </a:graphicData>
-                  </a:graphic>
-                </wp:inline>
-              </w:drawing>
-            </w:r>
-          </w:p>
-          <w:p>
-            <w:pPr>
-              <w:jc w:val="center"/>
-            </w:pPr>
-            <w:r>
-              <w:rPr>
-                <w:i/>
-              </w:rPr>
-              <w:t>图3-5c Dashboard 截图：错误率趋势（实机截图）</w:t>
-            </w:r>
-          </w:p>
-          <w:p>
-            <w:pPr>
-              <w:jc w:val="center"/>
-            </w:pPr>
-            <w:r>
-              <w:drawing>
-                <wp:inline xmlns:a="http://schemas.openxmlformats.org/drawingml/2006/main" xmlns:pic="http://schemas.openxmlformats.org/drawingml/2006/picture">
-                  <wp:extent cx="5715000" cy="2358694"/>
-                  <wp:docPr id="9" name="Picture 9"/>
-                  <wp:cNvGraphicFramePr>
-                    <a:graphicFrameLocks noChangeAspect="1"/>
-                  </wp:cNvGraphicFramePr>
-                  <a:graphic>
-                    <a:graphicData uri="http://schemas.openxmlformats.org/drawingml/2006/picture">
-                      <pic:pic>
-                        <pic:nvPicPr>
-                          <pic:cNvPr id="0" name="D3-6_Dashboard_04_TargetHealth.png"/>
-                          <pic:cNvPicPr/>
-                        </pic:nvPicPr>
-                        <pic:blipFill>
-                          <a:blip r:embed="rId17"/>
-                          <a:stretch>
-                            <a:fillRect/>
-                          </a:stretch>
-                        </pic:blipFill>
-                        <pic:spPr>
-                          <a:xfrm>
-                            <a:off x="0" y="0"/>
-                            <a:ext cx="5715000" cy="2358694"/>
-                          </a:xfrm>
-                          <a:prstGeom prst="rect"/>
-                        </pic:spPr>
-                      </pic:pic>
-                    </a:graphicData>
-                  </a:graphic>
-                </wp:inline>
-              </w:drawing>
-            </w:r>
-          </w:p>
-          <w:p>
-            <w:pPr>
-              <w:jc w:val="center"/>
-            </w:pPr>
-            <w:r>
-              <w:rPr>
-                <w:i/>
-              </w:rPr>
-              <w:t>图3-5d Dashboard 截图：目标健康与抓取耗时（实机截图）</w:t>
+              <w:t>图3-5 Grafana Dashboard 实机截图（完整视图）</w:t>
             </w:r>
           </w:p>
           <w:p>

</xml_diff>

<commit_message>
docs(lab3): update D3-6 observability report
</commit_message>
<xml_diff>
--- a/实验三_DevOps流水线与容器化部署/D3-6_可观测性配置与Dashboard截图.docx
+++ b/实验三_DevOps流水线与容器化部署/D3-6_可观测性配置与Dashboard截图.docx
@@ -16,23 +16,7 @@
           <w:sz w:val="28"/>
           <w:lang w:eastAsia="zh-CN"/>
         </w:rPr>
-        <w:t>北京林业大学</w:t>
-      </w:r>
-      <w:r>
-        <w:rPr>
-          <w:color w:val="777777"/>
-          <w:sz w:val="28"/>
-          <w:lang w:eastAsia="zh-CN"/>
-        </w:rPr>
-        <w:t xml:space="preserve"> · </w:t>
-      </w:r>
-      <w:r>
-        <w:rPr>
-          <w:color w:val="777777"/>
-          <w:sz w:val="28"/>
-          <w:lang w:eastAsia="zh-CN"/>
-        </w:rPr>
-        <w:t>信息学院</w:t>
+        <w:t>北京林业大学 · 信息学院</w:t>
       </w:r>
     </w:p>
     <w:p>
@@ -68,25 +52,7 @@
           <w:sz w:val="56"/>
           <w:lang w:eastAsia="zh-CN"/>
         </w:rPr>
-        <w:t>可观测性配置与</w:t>
-      </w:r>
-      <w:r>
-        <w:rPr>
-          <w:b/>
-          <w:color w:val="1A7A3D"/>
-          <w:sz w:val="56"/>
-          <w:lang w:eastAsia="zh-CN"/>
-        </w:rPr>
-        <w:t xml:space="preserve"> Dashboard </w:t>
-      </w:r>
-      <w:r>
-        <w:rPr>
-          <w:b/>
-          <w:color w:val="1A7A3D"/>
-          <w:sz w:val="56"/>
-          <w:lang w:eastAsia="zh-CN"/>
-        </w:rPr>
-        <w:t>截图</w:t>
+        <w:t>可观测性配置与 Dashboard 截图</w:t>
       </w:r>
     </w:p>
     <w:p>
@@ -113,39 +79,7 @@
           <w:color w:val="2E9B55"/>
           <w:sz w:val="26"/>
         </w:rPr>
-        <w:t xml:space="preserve">—— </w:t>
-      </w:r>
-      <w:r>
-        <w:rPr>
-          <w:b/>
-          <w:color w:val="2E9B55"/>
-          <w:sz w:val="26"/>
-        </w:rPr>
-        <w:t>案例：</w:t>
-      </w:r>
-      <w:r>
-        <w:rPr>
-          <w:b/>
-          <w:color w:val="2E9B55"/>
-          <w:sz w:val="26"/>
-        </w:rPr>
-        <w:t xml:space="preserve">NekoCafé </w:t>
-      </w:r>
-      <w:r>
-        <w:rPr>
-          <w:b/>
-          <w:color w:val="2E9B55"/>
-          <w:sz w:val="26"/>
-        </w:rPr>
-        <w:t>猫咪主题餐饮预约平台</w:t>
-      </w:r>
-      <w:r>
-        <w:rPr>
-          <w:b/>
-          <w:color w:val="2E9B55"/>
-          <w:sz w:val="26"/>
-        </w:rPr>
-        <w:t xml:space="preserve"> ——</w:t>
+        <w:t>—— 案例：NekoCafé 猫咪主题餐饮预约平台 ——</w:t>
       </w:r>
     </w:p>
     <w:p/>
@@ -264,19 +198,7 @@
               <w:rPr>
                 <w:color w:val="2B2B2B"/>
               </w:rPr>
-              <w:t>可观测性配置与</w:t>
-            </w:r>
-            <w:r>
-              <w:rPr>
-                <w:color w:val="2B2B2B"/>
-              </w:rPr>
-              <w:t xml:space="preserve"> Dashboard </w:t>
-            </w:r>
-            <w:r>
-              <w:rPr>
-                <w:color w:val="2B2B2B"/>
-              </w:rPr>
-              <w:t>截图</w:t>
+              <w:t>可观测性配置与 Dashboard 截图</w:t>
             </w:r>
           </w:p>
         </w:tc>
@@ -331,19 +253,7 @@
               <w:rPr>
                 <w:color w:val="2B2B2B"/>
               </w:rPr>
-              <w:t>实验三</w:t>
-            </w:r>
-            <w:r>
-              <w:rPr>
-                <w:color w:val="2B2B2B"/>
-              </w:rPr>
-              <w:t xml:space="preserve">  DevOps </w:t>
-            </w:r>
-            <w:r>
-              <w:rPr>
-                <w:color w:val="2B2B2B"/>
-              </w:rPr>
-              <w:t>流水线与容器化部署</w:t>
+              <w:t>实验三  DevOps 流水线与容器化部署</w:t>
             </w:r>
           </w:p>
         </w:tc>
@@ -402,14 +312,7 @@
                 <w:color w:val="2B2B2B"/>
                 <w:lang w:eastAsia="zh-CN"/>
               </w:rPr>
-              <w:t xml:space="preserve">NekoCafé </w:t>
-            </w:r>
-            <w:r>
-              <w:rPr>
-                <w:color w:val="2B2B2B"/>
-                <w:lang w:eastAsia="zh-CN"/>
-              </w:rPr>
-              <w:t>猫咪主题餐饮预约平台</w:t>
+              <w:t>NekoCafé 猫咪主题餐饮预约平台</w:t>
             </w:r>
           </w:p>
         </w:tc>
@@ -495,35 +398,7 @@
                 <w:b/>
                 <w:color w:val="1A7A3D"/>
               </w:rPr>
-              <w:t>班级</w:t>
-            </w:r>
-            <w:r>
-              <w:rPr>
-                <w:b/>
-                <w:color w:val="1A7A3D"/>
-              </w:rPr>
-              <w:t xml:space="preserve"> / </w:t>
-            </w:r>
-            <w:r>
-              <w:rPr>
-                <w:b/>
-                <w:color w:val="1A7A3D"/>
-              </w:rPr>
-              <w:t>学号</w:t>
-            </w:r>
-            <w:r>
-              <w:rPr>
-                <w:b/>
-                <w:color w:val="1A7A3D"/>
-              </w:rPr>
-              <w:t xml:space="preserve"> / </w:t>
-            </w:r>
-            <w:r>
-              <w:rPr>
-                <w:b/>
-                <w:color w:val="1A7A3D"/>
-              </w:rPr>
-              <w:t>姓名</w:t>
+              <w:t>班级 / 学号 / 姓名</w:t>
             </w:r>
           </w:p>
         </w:tc>
@@ -541,13 +416,7 @@
           </w:tcPr>
           <w:p>
             <w:r>
-              <w:t>计算机</w:t>
-            </w:r>
-            <w:r>
-              <w:t xml:space="preserve">23-2 / 231002703 / </w:t>
-            </w:r>
-            <w:r>
-              <w:t>戴正宇</w:t>
+              <w:t>计算机23-2 / 231002703 / 戴正宇</w:t>
             </w:r>
           </w:p>
         </w:tc>
@@ -639,35 +508,7 @@
           <w:color w:val="2B2B2B"/>
           <w:lang w:eastAsia="zh-CN"/>
         </w:rPr>
-        <w:t>证明系统具备</w:t>
-      </w:r>
-      <w:r>
-        <w:rPr>
-          <w:color w:val="2B2B2B"/>
-          <w:lang w:eastAsia="zh-CN"/>
-        </w:rPr>
-        <w:t xml:space="preserve">"3 </w:t>
-      </w:r>
-      <w:r>
-        <w:rPr>
-          <w:color w:val="2B2B2B"/>
-          <w:lang w:eastAsia="zh-CN"/>
-        </w:rPr>
-        <w:t>分钟内能定位到具体服务、节点、接口</w:t>
-      </w:r>
-      <w:r>
-        <w:rPr>
-          <w:color w:val="2B2B2B"/>
-          <w:lang w:eastAsia="zh-CN"/>
-        </w:rPr>
-        <w:t>"</w:t>
-      </w:r>
-      <w:r>
-        <w:rPr>
-          <w:color w:val="2B2B2B"/>
-          <w:lang w:eastAsia="zh-CN"/>
-        </w:rPr>
-        <w:t>的能力。</w:t>
+        <w:t>证明系统具备"3 分钟内能定位到具体服务、节点、接口"的能力。</w:t>
       </w:r>
     </w:p>
     <w:tbl>
@@ -717,21 +558,7 @@
               <w:rPr>
                 <w:lang w:eastAsia="zh-CN"/>
               </w:rPr>
-              <w:t>本文件已按实验</w:t>
-            </w:r>
-            <w:proofErr w:type="gramStart"/>
-            <w:r>
-              <w:rPr>
-                <w:lang w:eastAsia="zh-CN"/>
-              </w:rPr>
-              <w:t>三任务</w:t>
-            </w:r>
-            <w:proofErr w:type="gramEnd"/>
-            <w:r>
-              <w:rPr>
-                <w:lang w:eastAsia="zh-CN"/>
-              </w:rPr>
-              <w:t>书和模板章节完成填报；保留原章节结构，未使用的截图位置以文字说明记录复现实验步骤。</w:t>
+              <w:t>本文件已按实验三任务书和模板章节完成填报；保留原章节结构，未使用的截图位置以文字说明记录复现实验步骤。</w:t>
             </w:r>
           </w:p>
         </w:tc>
@@ -752,31 +579,13 @@
         </w:pBdr>
         <w:spacing w:before="280" w:after="120"/>
       </w:pPr>
-      <w:proofErr w:type="gramStart"/>
       <w:r>
         <w:rPr>
           <w:b/>
           <w:color w:val="1A7A3D"/>
           <w:sz w:val="36"/>
         </w:rPr>
-        <w:t>1  OpenTelemetry</w:t>
-      </w:r>
-      <w:proofErr w:type="gramEnd"/>
-      <w:r>
-        <w:rPr>
-          <w:b/>
-          <w:color w:val="1A7A3D"/>
-          <w:sz w:val="36"/>
-        </w:rPr>
-        <w:t xml:space="preserve"> </w:t>
-      </w:r>
-      <w:r>
-        <w:rPr>
-          <w:b/>
-          <w:color w:val="1A7A3D"/>
-          <w:sz w:val="36"/>
-        </w:rPr>
-        <w:t>接入</w:t>
+        <w:t>1  OpenTelemetry 接入</w:t>
       </w:r>
     </w:p>
     <w:p>
@@ -793,15 +602,7 @@
           <w:color w:val="1A7A3D"/>
           <w:sz w:val="30"/>
         </w:rPr>
-        <w:t xml:space="preserve">1.1  SDK </w:t>
-      </w:r>
-      <w:r>
-        <w:rPr>
-          <w:b/>
-          <w:color w:val="1A7A3D"/>
-          <w:sz w:val="30"/>
-        </w:rPr>
-        <w:t>版本</w:t>
+        <w:t>1.1  SDK 版本</w:t>
       </w:r>
     </w:p>
     <w:tbl>
@@ -834,15 +635,124 @@
             </w:r>
           </w:p>
           <w:p>
-            <w:pPr/>
-            <w:r>
-              <w:t>可观测性目标：当预约接口变慢或失败时，值班人员应能在 3 分钟内完成定位：先从 Grafana 判断是哪个服务的 RED 指标异常，再从 Prometheus 查询具体 route/status，再通过 traceId 关联 JSON 日志，最后结合部署窗口判断是否与新版本发布有关。</w:t>
+            <w:r>
+              <w:t>可观测性目标：当预约接口变慢或失败时，值班人员应能在</w:t>
+            </w:r>
+            <w:r>
+              <w:t xml:space="preserve"> 3 </w:t>
+            </w:r>
+            <w:r>
+              <w:t>分钟内完成定位：先从</w:t>
+            </w:r>
+            <w:r>
+              <w:t xml:space="preserve"> Grafana </w:t>
+            </w:r>
+            <w:r>
+              <w:t>判断是哪个服务的</w:t>
+            </w:r>
+            <w:r>
+              <w:t xml:space="preserve"> RED </w:t>
+            </w:r>
+            <w:r>
+              <w:t>指标异常，再从</w:t>
+            </w:r>
+            <w:r>
+              <w:t xml:space="preserve"> Prometheus </w:t>
+            </w:r>
+            <w:r>
+              <w:t>查询具体</w:t>
+            </w:r>
+            <w:r>
+              <w:t xml:space="preserve"> route</w:t>
+            </w:r>
+            <w:r>
+              <w:t>/status</w:t>
+            </w:r>
+            <w:r>
+              <w:t>，再通过</w:t>
+            </w:r>
+            <w:r>
+              <w:t xml:space="preserve"> traceId </w:t>
+            </w:r>
+            <w:r>
+              <w:t>关联</w:t>
+            </w:r>
+            <w:r>
+              <w:t xml:space="preserve"> JSON </w:t>
+            </w:r>
+            <w:r>
+              <w:t>日志，最后结合部署窗口判断是否与新版本发布有关。</w:t>
             </w:r>
           </w:p>
           <w:p>
-            <w:pPr/>
-            <w:r>
-              <w:t>图3-4 展示了可观测数据从服务端点到 Dashboard 的采集链路：reservation/member 暴露 /metrics，Prometheus 定时抓取，Grafana 读取 Prometheus 数据源展示 RED/USE 面板；日志通过结构化字段进入 Loki/ELK；告警规则由 PrometheusRule 或 Alertmanager 承接。</w:t>
+            <w:r>
+              <w:t>图</w:t>
+            </w:r>
+            <w:r>
+              <w:t xml:space="preserve">3-4 </w:t>
+            </w:r>
+            <w:r>
+              <w:t>展示了可观测数据从服务端点到</w:t>
+            </w:r>
+            <w:r>
+              <w:t xml:space="preserve"> Dashboard </w:t>
+            </w:r>
+            <w:r>
+              <w:t>的采集链路：</w:t>
+            </w:r>
+            <w:r>
+              <w:t xml:space="preserve">reservation/member </w:t>
+            </w:r>
+            <w:r>
+              <w:t>暴露</w:t>
+            </w:r>
+            <w:r>
+              <w:t xml:space="preserve"> /metrics</w:t>
+            </w:r>
+            <w:r>
+              <w:t>，</w:t>
+            </w:r>
+            <w:r>
+              <w:t xml:space="preserve">Prometheus </w:t>
+            </w:r>
+            <w:r>
+              <w:t>定时抓取，</w:t>
+            </w:r>
+            <w:r>
+              <w:t xml:space="preserve">Grafana </w:t>
+            </w:r>
+            <w:r>
+              <w:t>读取</w:t>
+            </w:r>
+            <w:r>
+              <w:t xml:space="preserve"> Prometheus </w:t>
+            </w:r>
+            <w:r>
+              <w:t>数据源展示</w:t>
+            </w:r>
+            <w:r>
+              <w:t xml:space="preserve"> RED/USE </w:t>
+            </w:r>
+            <w:r>
+              <w:t>面板；日志通过结构化字段进入</w:t>
+            </w:r>
+            <w:r>
+              <w:t xml:space="preserve"> Loki/ELK</w:t>
+            </w:r>
+            <w:r>
+              <w:t>；告警规则由</w:t>
+            </w:r>
+            <w:r>
+              <w:t xml:space="preserve"> PrometheusRule </w:t>
+            </w:r>
+            <w:r>
+              <w:t>或</w:t>
+            </w:r>
+            <w:r>
+              <w:t xml:space="preserve"> Alertmanager </w:t>
+            </w:r>
+            <w:r>
+              <w:t>承接。</w:t>
             </w:r>
           </w:p>
           <w:p>
@@ -858,8 +768,9 @@
               <w:rPr>
                 <w:noProof/>
               </w:rPr>
+              <w:lastRenderedPageBreak/>
               <w:drawing>
-                <wp:inline distT="0" distB="0" distL="0" distR="0" wp14:anchorId="0228FE5F" wp14:editId="79B346C5">
+                <wp:inline distT="0" distB="0" distL="0" distR="0" wp14:anchorId="225754AD" wp14:editId="0B5834D0">
                   <wp:extent cx="5760720" cy="3170100"/>
                   <wp:effectExtent l="0" t="0" r="0" b="0"/>
                   <wp:docPr id="12" name="Picture 12"/>
@@ -908,31 +819,8 @@
                 <w:iCs/>
                 <w:lang w:eastAsia="zh-CN"/>
               </w:rPr>
-              <w:t>图</w:t>
-            </w:r>
-            <w:r>
-              <w:rPr>
-                <w:iCs/>
-                <w:lang w:eastAsia="zh-CN"/>
-              </w:rPr>
-              <w:t xml:space="preserve">3-4 </w:t>
-            </w:r>
-            <w:r>
-              <w:rPr>
-                <w:iCs/>
-                <w:lang w:eastAsia="zh-CN"/>
-              </w:rPr>
-              <w:t>可观测性采集链路总</w:t>
-            </w:r>
-            <w:proofErr w:type="gramStart"/>
-            <w:r>
-              <w:rPr>
-                <w:iCs/>
-                <w:lang w:eastAsia="zh-CN"/>
-              </w:rPr>
-              <w:t>览</w:t>
-            </w:r>
-            <w:proofErr w:type="gramEnd"/>
+              <w:t>图3-4 可观测性采集链路总览</w:t>
+            </w:r>
           </w:p>
         </w:tc>
       </w:tr>
@@ -952,24 +840,14 @@
         </w:pBdr>
         <w:spacing w:before="200" w:after="120"/>
       </w:pPr>
-      <w:proofErr w:type="gramStart"/>
       <w:r>
         <w:rPr>
           <w:b/>
           <w:color w:val="1A7A3D"/>
           <w:sz w:val="30"/>
         </w:rPr>
-        <w:t xml:space="preserve">1.2  </w:t>
+        <w:t>1.2  采样策略</w:t>
       </w:r>
-      <w:r>
-        <w:rPr>
-          <w:b/>
-          <w:color w:val="1A7A3D"/>
-          <w:sz w:val="30"/>
-        </w:rPr>
-        <w:t>采样策略</w:t>
-      </w:r>
-      <w:proofErr w:type="gramEnd"/>
     </w:p>
     <w:tbl>
       <w:tblPr>
@@ -1004,10 +882,14 @@
             <w:r>
               <w:rPr>
                 <w:b/>
+                <w:lang w:eastAsia="zh-CN"/>
               </w:rPr>
               <w:t>采样策略：</w:t>
             </w:r>
             <w:r>
+              <w:rPr>
+                <w:lang w:eastAsia="zh-CN"/>
+              </w:rPr>
               <w:t>开发环境 100% 采样，便于调试每一次请求；staging 默认 20% 概率采样，用于灰度发布期间观察趋势；prod 默认 5% 概率采样，错误请求、慢请求和带有异常状态码的请求强制保留。采样率不是固定不变的，发布窗口、故障排查和压测期间可以临时上调，故障恢复后再降回默认值以控制成本。</w:t>
             </w:r>
           </w:p>
@@ -1074,15 +956,8 @@
           <w:color w:val="1A7A3D"/>
           <w:sz w:val="36"/>
         </w:rPr>
-        <w:t xml:space="preserve">2  </w:t>
-      </w:r>
-      <w:r>
-        <w:rPr>
-          <w:b/>
-          <w:color w:val="1A7A3D"/>
-          <w:sz w:val="36"/>
-        </w:rPr>
-        <w:t>日志规范</w:t>
+        <w:lastRenderedPageBreak/>
+        <w:t>2  日志规范</w:t>
       </w:r>
     </w:p>
     <w:p>
@@ -1099,15 +974,7 @@
           <w:color w:val="1A7A3D"/>
           <w:sz w:val="30"/>
         </w:rPr>
-        <w:t xml:space="preserve">2.1  </w:t>
-      </w:r>
-      <w:r>
-        <w:rPr>
-          <w:b/>
-          <w:color w:val="1A7A3D"/>
-          <w:sz w:val="30"/>
-        </w:rPr>
-        <w:t>字段约定</w:t>
+        <w:t>2.1  字段约定</w:t>
       </w:r>
     </w:p>
     <w:tbl>
@@ -1146,143 +1013,114 @@
             </w:r>
           </w:p>
           <w:p>
-            <w:pPr/>
-            <w:r>
-              <w:t>日志检索示例：当 Grafana 显示 reservation 错误率升高时，可按 service=reservation AND level=ERROR 过滤，再按 traceId 聚合相关日志；如果仅某个 route 异常，可增加 path=/reservations 条件缩小范围。这样可以从“面板异常”快速收敛到“具体接口和具体请求”。</w:t>
+            <w:pPr>
+              <w:rPr>
+                <w:lang w:eastAsia="zh-CN"/>
+              </w:rPr>
+            </w:pPr>
+            <w:r>
+              <w:t>日志检索示例：当</w:t>
+            </w:r>
+            <w:r>
+              <w:t xml:space="preserve"> Grafana </w:t>
+            </w:r>
+            <w:r>
+              <w:t>显示</w:t>
+            </w:r>
+            <w:r>
+              <w:t xml:space="preserve"> reservation </w:t>
+            </w:r>
+            <w:r>
+              <w:t>错误率升高时，可按</w:t>
+            </w:r>
+            <w:r>
+              <w:t xml:space="preserve"> service=reservation AND level=ERROR </w:t>
+            </w:r>
+            <w:r>
+              <w:t>过滤，再按</w:t>
+            </w:r>
+            <w:r>
+              <w:t xml:space="preserve"> traceId </w:t>
+            </w:r>
+            <w:r>
+              <w:t>聚合相关日志；如果仅某个</w:t>
+            </w:r>
+            <w:r>
+              <w:t xml:space="preserve"> route </w:t>
+            </w:r>
+            <w:r>
+              <w:t>异常，可增加</w:t>
+            </w:r>
+            <w:r>
+              <w:t xml:space="preserve"> path=/reservations </w:t>
+            </w:r>
+            <w:r>
+              <w:t>条件缩小范围。</w:t>
+            </w:r>
+            <w:r>
+              <w:rPr>
+                <w:lang w:eastAsia="zh-CN"/>
+              </w:rPr>
+              <w:t>这样可以从</w:t>
+            </w:r>
+            <w:r>
+              <w:rPr>
+                <w:lang w:eastAsia="zh-CN"/>
+              </w:rPr>
+              <w:t>“</w:t>
+            </w:r>
+            <w:r>
+              <w:rPr>
+                <w:lang w:eastAsia="zh-CN"/>
+              </w:rPr>
+              <w:t>面板异常</w:t>
+            </w:r>
+            <w:r>
+              <w:rPr>
+                <w:lang w:eastAsia="zh-CN"/>
+              </w:rPr>
+              <w:t>”</w:t>
+            </w:r>
+            <w:r>
+              <w:rPr>
+                <w:lang w:eastAsia="zh-CN"/>
+              </w:rPr>
+              <w:t>快速收敛到</w:t>
+            </w:r>
+            <w:r>
+              <w:rPr>
+                <w:lang w:eastAsia="zh-CN"/>
+              </w:rPr>
+              <w:t>“</w:t>
+            </w:r>
+            <w:r>
+              <w:rPr>
+                <w:lang w:eastAsia="zh-CN"/>
+              </w:rPr>
+              <w:t>具体接口和具体请求</w:t>
+            </w:r>
+            <w:r>
+              <w:rPr>
+                <w:lang w:eastAsia="zh-CN"/>
+              </w:rPr>
+              <w:t>”</w:t>
+            </w:r>
+            <w:r>
+              <w:rPr>
+                <w:lang w:eastAsia="zh-CN"/>
+              </w:rPr>
+              <w:t>。</w:t>
             </w:r>
           </w:p>
         </w:tc>
       </w:tr>
     </w:tbl>
-    <w:p/>
     <w:p>
       <w:pPr>
-        <w:keepNext/>
-        <w:pBdr>
-          <w:bottom w:val="single" w:sz="4" w:space="4" w:color="4DB872"/>
-        </w:pBdr>
-        <w:spacing w:before="200" w:after="120"/>
+        <w:rPr>
+          <w:lang w:eastAsia="zh-CN"/>
+        </w:rPr>
       </w:pPr>
-      <w:r>
-        <w:rPr>
-          <w:b/>
-          <w:color w:val="1A7A3D"/>
-          <w:sz w:val="30"/>
-        </w:rPr>
-        <w:t xml:space="preserve">2.2  </w:t>
-      </w:r>
-      <w:r>
-        <w:rPr>
-          <w:b/>
-          <w:color w:val="1A7A3D"/>
-          <w:sz w:val="30"/>
-        </w:rPr>
-        <w:t>脱敏策略</w:t>
-      </w:r>
-    </w:p>
-    <w:tbl>
-      <w:tblPr>
-        <w:tblW w:w="0" w:type="auto"/>
-        <w:jc w:val="center"/>
-        <w:tblLook w:val="04A0" w:firstRow="1" w:lastRow="0" w:firstColumn="1" w:lastColumn="0" w:noHBand="0" w:noVBand="1"/>
-      </w:tblPr>
-      <w:tblGrid>
-        <w:gridCol w:w="9746"/>
-      </w:tblGrid>
-      <w:tr>
-        <w:trPr>
-          <w:jc w:val="center"/>
-        </w:trPr>
-        <w:tc>
-          <w:tcPr>
-            <w:tcW w:w="9746" w:type="dxa"/>
-            <w:tcBorders>
-              <w:top w:val="single" w:sz="4" w:space="0" w:color="B8D8C2"/>
-              <w:left w:val="single" w:sz="4" w:space="0" w:color="B8D8C2"/>
-              <w:bottom w:val="single" w:sz="4" w:space="0" w:color="B8D8C2"/>
-              <w:right w:val="single" w:sz="4" w:space="0" w:color="B8D8C2"/>
-            </w:tcBorders>
-            <w:shd w:val="clear" w:color="auto" w:fill="FBFDFB"/>
-          </w:tcPr>
-          <w:p>
-            <w:r>
-              <w:rPr>
-                <w:b/>
-              </w:rPr>
-              <w:t>脱敏策略：</w:t>
-            </w:r>
-            <w:r>
-              <w:t>手机号只保留后四位；邮箱保留域名；specialRequest 默认不打印原文，只记录长度和类别；Authorization、Cookie、Set-Cookie 永不写日志；支付流水、短信验证码和隐私授权字段只记录状态码或哈希摘要。脱敏策略既保护用户隐私，也避免截图和日志在课程提交过程中泄露敏感信息。</w:t>
-            </w:r>
-          </w:p>
-        </w:tc>
-      </w:tr>
-    </w:tbl>
-    <w:p/>
-    <w:tbl>
-      <w:tblPr>
-        <w:tblW w:w="0" w:type="auto"/>
-        <w:jc w:val="center"/>
-        <w:tblLook w:val="04A0" w:firstRow="1" w:lastRow="0" w:firstColumn="1" w:lastColumn="0" w:noHBand="0" w:noVBand="1"/>
-      </w:tblPr>
-      <w:tblGrid>
-        <w:gridCol w:w="9746"/>
-      </w:tblGrid>
-      <w:tr>
-        <w:trPr>
-          <w:jc w:val="center"/>
-        </w:trPr>
-        <w:tc>
-          <w:tcPr>
-            <w:tcW w:w="9746" w:type="dxa"/>
-            <w:tcBorders>
-              <w:top w:val="single" w:sz="4" w:space="0" w:color="B8D8C2"/>
-              <w:left w:val="single" w:sz="4" w:space="0" w:color="B8D8C2"/>
-              <w:bottom w:val="single" w:sz="4" w:space="0" w:color="B8D8C2"/>
-              <w:right w:val="single" w:sz="4" w:space="0" w:color="B8D8C2"/>
-            </w:tcBorders>
-            <w:shd w:val="clear" w:color="auto" w:fill="FBFDFB"/>
-          </w:tcPr>
-          <w:p>
-            <w:r>
-              <w:rPr>
-                <w:b/>
-              </w:rPr>
-              <w:t>指标暴露：</w:t>
-            </w:r>
-            <w:r>
-              <w:t>/metrics 输出 Prometheus 文本格式，包含 http_requests_total、http_request_errors_total、http_request_duration_ms_count/sum、service_info 等指标。Prometheus 配置见 D3-2 config/prometheus/prometheus.yml，Kubernetes 目标态通过 D3-5 的 ServiceMonitor 采集同一指标路径，确保本地 Compose 与集群部署的监控口径一致。</w:t>
-            </w:r>
-          </w:p>
-        </w:tc>
-      </w:tr>
-    </w:tbl>
-    <w:p/>
-    <w:p>
-      <w:pPr>
-        <w:keepNext/>
-        <w:pBdr>
-          <w:bottom w:val="single" w:sz="8" w:space="4" w:color="1A7A3D"/>
-        </w:pBdr>
-        <w:spacing w:before="280" w:after="120"/>
-      </w:pPr>
-      <w:r>
-        <w:rPr>
-          <w:b/>
-          <w:color w:val="1A7A3D"/>
-          <w:sz w:val="36"/>
-        </w:rPr>
-        <w:lastRenderedPageBreak/>
-        <w:t xml:space="preserve">3  Metrics </w:t>
-      </w:r>
-      <w:r>
-        <w:rPr>
-          <w:b/>
-          <w:color w:val="1A7A3D"/>
-          <w:sz w:val="36"/>
-        </w:rPr>
-        <w:t>指标清单</w:t>
-      </w:r>
     </w:p>
     <w:p>
       <w:pPr>
@@ -1298,198 +1136,7 @@
           <w:color w:val="1A7A3D"/>
           <w:sz w:val="30"/>
         </w:rPr>
-        <w:t xml:space="preserve">3.1  RED </w:t>
-      </w:r>
-      <w:r>
-        <w:rPr>
-          <w:b/>
-          <w:color w:val="1A7A3D"/>
-          <w:sz w:val="30"/>
-        </w:rPr>
-        <w:t>三指标</w:t>
-      </w:r>
-    </w:p>
-    <w:tbl>
-      <w:tblPr>
-        <w:tblW w:w="0" w:type="auto"/>
-        <w:jc w:val="center"/>
-        <w:tblLook w:val="04A0" w:firstRow="1" w:lastRow="0" w:firstColumn="1" w:lastColumn="0" w:noHBand="0" w:noVBand="1"/>
-      </w:tblPr>
-      <w:tblGrid>
-        <w:gridCol w:w="9746"/>
-      </w:tblGrid>
-      <w:tr>
-        <w:trPr>
-          <w:jc w:val="center"/>
-        </w:trPr>
-        <w:tc>
-          <w:tcPr>
-            <w:tcW w:w="9746" w:type="dxa"/>
-            <w:tcBorders>
-              <w:top w:val="single" w:sz="4" w:space="0" w:color="B8D8C2"/>
-              <w:left w:val="single" w:sz="4" w:space="0" w:color="B8D8C2"/>
-              <w:bottom w:val="single" w:sz="4" w:space="0" w:color="B8D8C2"/>
-              <w:right w:val="single" w:sz="4" w:space="0" w:color="B8D8C2"/>
-            </w:tcBorders>
-            <w:shd w:val="clear" w:color="auto" w:fill="FBFDFB"/>
-          </w:tcPr>
-          <w:p>
-            <w:r>
-              <w:rPr>
-                <w:b/>
-              </w:rPr>
-              <w:t>RED 指标：</w:t>
-            </w:r>
-            <w:r>
-              <w:t>Rate 按 service/route/status 统计请求速率，用于判断流量是否异常；Errors 统计 5xx、探针失败和关键业务异常，用于判断用户是否受影响；Duration 统计 P50/P95/P99 延迟，用于判断预约创建、会员查询等接口是否变慢。RED 是发布后最优先观察的用户体验指标。</w:t>
-            </w:r>
-          </w:p>
-        </w:tc>
-      </w:tr>
-    </w:tbl>
-    <w:p/>
-    <w:p>
-      <w:pPr>
-        <w:keepNext/>
-        <w:pBdr>
-          <w:bottom w:val="single" w:sz="4" w:space="4" w:color="4DB872"/>
-        </w:pBdr>
-        <w:spacing w:before="200" w:after="120"/>
-      </w:pPr>
-      <w:r>
-        <w:rPr>
-          <w:b/>
-          <w:color w:val="1A7A3D"/>
-          <w:sz w:val="30"/>
-        </w:rPr>
-        <w:t xml:space="preserve">3.2  USE </w:t>
-      </w:r>
-      <w:r>
-        <w:rPr>
-          <w:b/>
-          <w:color w:val="1A7A3D"/>
-          <w:sz w:val="30"/>
-        </w:rPr>
-        <w:t>三指标</w:t>
-      </w:r>
-    </w:p>
-    <w:tbl>
-      <w:tblPr>
-        <w:tblW w:w="0" w:type="auto"/>
-        <w:jc w:val="center"/>
-        <w:tblLook w:val="04A0" w:firstRow="1" w:lastRow="0" w:firstColumn="1" w:lastColumn="0" w:noHBand="0" w:noVBand="1"/>
-      </w:tblPr>
-      <w:tblGrid>
-        <w:gridCol w:w="9746"/>
-      </w:tblGrid>
-      <w:tr>
-        <w:trPr>
-          <w:jc w:val="center"/>
-        </w:trPr>
-        <w:tc>
-          <w:tcPr>
-            <w:tcW w:w="9746" w:type="dxa"/>
-            <w:tcBorders>
-              <w:top w:val="single" w:sz="4" w:space="0" w:color="B8D8C2"/>
-              <w:left w:val="single" w:sz="4" w:space="0" w:color="B8D8C2"/>
-              <w:bottom w:val="single" w:sz="4" w:space="0" w:color="B8D8C2"/>
-              <w:right w:val="single" w:sz="4" w:space="0" w:color="B8D8C2"/>
-            </w:tcBorders>
-            <w:shd w:val="clear" w:color="auto" w:fill="FBFDFB"/>
-          </w:tcPr>
-          <w:p>
-            <w:r>
-              <w:rPr>
-                <w:b/>
-              </w:rPr>
-              <w:t>USE 指标：</w:t>
-            </w:r>
-            <w:r>
-              <w:t>Utilization 表示 CPU、内存、连接池等资源使用率；Saturation 表示队列积压、Redis 连接等待、Pod 调度等待等饱和度；Errors 表示容器重启、OOM、探针失败和节点异常。USE 用于区分“代码逻辑错误”和“资源不足/环境异常”。</w:t>
-            </w:r>
-          </w:p>
-        </w:tc>
-      </w:tr>
-    </w:tbl>
-    <w:p/>
-    <w:tbl>
-      <w:tblPr>
-        <w:tblW w:w="0" w:type="auto"/>
-        <w:jc w:val="center"/>
-        <w:tblLook w:val="04A0" w:firstRow="1" w:lastRow="0" w:firstColumn="1" w:lastColumn="0" w:noHBand="0" w:noVBand="1"/>
-      </w:tblPr>
-      <w:tblGrid>
-        <w:gridCol w:w="9746"/>
-      </w:tblGrid>
-      <w:tr>
-        <w:trPr>
-          <w:jc w:val="center"/>
-        </w:trPr>
-        <w:tc>
-          <w:tcPr>
-            <w:tcW w:w="9746" w:type="dxa"/>
-            <w:tcBorders>
-              <w:top w:val="single" w:sz="4" w:space="0" w:color="B8D8C2"/>
-              <w:left w:val="single" w:sz="4" w:space="0" w:color="B8D8C2"/>
-              <w:bottom w:val="single" w:sz="4" w:space="0" w:color="B8D8C2"/>
-              <w:right w:val="single" w:sz="4" w:space="0" w:color="B8D8C2"/>
-            </w:tcBorders>
-            <w:shd w:val="clear" w:color="auto" w:fill="FBFDFB"/>
-          </w:tcPr>
-          <w:p>
-            <w:r>
-              <w:rPr>
-                <w:b/>
-              </w:rPr>
-              <w:t>Grafana Dashboard 面板：</w:t>
-            </w:r>
-            <w:r>
-              <w:t>1. QPS by service；2. P95/P99 latency；3. Error rate；4. CPU/Memory usage；5. Reservation success rate；6. Deployment markers；7. Prometheus target health；8. Container restart trend。面板按“先业务后资源”的顺序排列，便于值班人员从用户影响逐层下钻到服务和基础设施。</w:t>
-            </w:r>
-          </w:p>
-        </w:tc>
-      </w:tr>
-    </w:tbl>
-    <w:p/>
-    <w:p>
-      <w:pPr>
-        <w:keepNext/>
-        <w:pBdr>
-          <w:bottom w:val="single" w:sz="8" w:space="4" w:color="1A7A3D"/>
-        </w:pBdr>
-        <w:spacing w:before="280" w:after="120"/>
-      </w:pPr>
-      <w:r>
-        <w:rPr>
-          <w:b/>
-          <w:color w:val="1A7A3D"/>
-          <w:sz w:val="36"/>
-        </w:rPr>
-        <w:t xml:space="preserve">4  Dashboard </w:t>
-      </w:r>
-      <w:r>
-        <w:rPr>
-          <w:b/>
-          <w:color w:val="1A7A3D"/>
-          <w:sz w:val="36"/>
-        </w:rPr>
-        <w:t>截图（</w:t>
-      </w:r>
-      <w:r>
-        <w:rPr>
-          <w:b/>
-          <w:color w:val="1A7A3D"/>
-          <w:sz w:val="36"/>
-        </w:rPr>
-        <w:t xml:space="preserve">≥ 4 </w:t>
-      </w:r>
-      <w:r>
-        <w:rPr>
-          <w:b/>
-          <w:color w:val="1A7A3D"/>
-          <w:sz w:val="36"/>
-        </w:rPr>
-        <w:t>张）</w:t>
+        <w:t>2.2  脱敏策略</w:t>
       </w:r>
     </w:p>
     <w:tbl>
@@ -1522,20 +1169,20 @@
                 <w:lang w:eastAsia="zh-CN"/>
               </w:rPr>
             </w:pPr>
-            <w:proofErr w:type="gramStart"/>
-            <w:proofErr w:type="gramEnd"/>
-            <w:proofErr w:type="gramStart"/>
-            <w:proofErr w:type="gramEnd"/>
-            <w:proofErr w:type="gramStart"/>
-            <w:proofErr w:type="gramEnd"/>
             <w:r>
               <w:rPr>
                 <w:b/>
               </w:rPr>
-              <w:t>四层展示：</w:t>
-            </w:r>
-            <w:r>
-              <w:t>业务层展示预约成功率、取消率和支付回调成功率；应用层展示 HTTP 延迟、错误率和慢请求；中间件层展示 Redis/PostgreSQL 健康、连接等待和缓存命中；基础设施层展示 Pod CPU/内存、重启次数和 Prometheus target 状态。四层指标共同回答“有没有影响用户、影响哪个服务、是否由资源或依赖引起”。</w:t>
+              <w:t>脱敏策略：</w:t>
+            </w:r>
+            <w:r>
+              <w:t>手机号只保留后四位；邮箱保留域名；specialRequest 默认不打印原文，只记录长度和类别；Authorization、Cookie、Set-Cookie 永不写日志；支付流水、短信验证码和隐私授权字段只记录状态码或哈希摘要。</w:t>
+            </w:r>
+            <w:r>
+              <w:rPr>
+                <w:lang w:eastAsia="zh-CN"/>
+              </w:rPr>
+              <w:t>脱敏策略既保护用户隐私，也避免截图和日志在课程提交过程中泄露敏感信息。</w:t>
             </w:r>
           </w:p>
         </w:tc>
@@ -1547,66 +1194,6 @@
           <w:lang w:eastAsia="zh-CN"/>
         </w:rPr>
       </w:pPr>
-    </w:p>
-    <w:p>
-      <w:pPr>
-        <w:keepNext/>
-        <w:pBdr>
-          <w:bottom w:val="single" w:sz="8" w:space="4" w:color="1A7A3D"/>
-        </w:pBdr>
-        <w:spacing w:before="280" w:after="120"/>
-      </w:pPr>
-      <w:proofErr w:type="gramStart"/>
-      <w:r>
-        <w:rPr>
-          <w:b/>
-          <w:color w:val="1A7A3D"/>
-          <w:sz w:val="36"/>
-        </w:rPr>
-        <w:t xml:space="preserve">5  </w:t>
-      </w:r>
-      <w:r>
-        <w:rPr>
-          <w:b/>
-          <w:color w:val="1A7A3D"/>
-          <w:sz w:val="36"/>
-        </w:rPr>
-        <w:t>告警规则</w:t>
-      </w:r>
-      <w:proofErr w:type="gramEnd"/>
-    </w:p>
-    <w:p>
-      <w:pPr>
-        <w:keepNext/>
-        <w:pBdr>
-          <w:bottom w:val="single" w:sz="4" w:space="4" w:color="4DB872"/>
-        </w:pBdr>
-        <w:spacing w:before="200" w:after="120"/>
-      </w:pPr>
-      <w:r>
-        <w:rPr>
-          <w:b/>
-          <w:color w:val="1A7A3D"/>
-          <w:sz w:val="30"/>
-        </w:rPr>
-        <w:t xml:space="preserve">5.1  </w:t>
-      </w:r>
-      <w:r>
-        <w:rPr>
-          <w:b/>
-          <w:color w:val="1A7A3D"/>
-          <w:sz w:val="30"/>
-        </w:rPr>
-        <w:t>规则</w:t>
-      </w:r>
-      <w:r>
-        <w:rPr>
-          <w:b/>
-          <w:color w:val="1A7A3D"/>
-          <w:sz w:val="30"/>
-        </w:rPr>
-        <w:t xml:space="preserve"> YAML</w:t>
-      </w:r>
     </w:p>
     <w:tbl>
       <w:tblPr>
@@ -1637,16 +1224,33 @@
               <w:rPr>
                 <w:b/>
               </w:rPr>
-              <w:t>PrometheusRule 摘要：</w:t>
-            </w:r>
-            <w:r>
-              <w:t>HighErrorRate 当 5 分钟错误率 &gt; 1%；HighLatency 当 P95 &gt; 350ms；ServiceDown 当 up==0 超过 2 分钟；ContainerRestart 当 10 分钟内重启次数异常增长；ScrapeTargetMissing 当 Prometheus 无法抓取目标。完整规则可放入 Helm templates/servicemonitor.yaml 或监控仓库，并在 D3-4 CD 流水线中作为发布后观察依据。</w:t>
+              <w:t>指标暴露：</w:t>
+            </w:r>
+            <w:r>
+              <w:t>/metrics 输出 Prometheus 文本格式，包含 http_requests_total、http_request_errors_total、http_request_duration_ms_count/sum、service_info 等指标。Prometheus 配置见 D3-2 config/prometheus/prometheus.yml，Kubernetes 目标态通过 D3-5 的 ServiceMonitor 采集同一指标路径，确保本地 Compose 与集群部署的监控口径一致。</w:t>
             </w:r>
           </w:p>
         </w:tc>
       </w:tr>
     </w:tbl>
     <w:p/>
+    <w:p>
+      <w:pPr>
+        <w:keepNext/>
+        <w:pBdr>
+          <w:bottom w:val="single" w:sz="8" w:space="4" w:color="1A7A3D"/>
+        </w:pBdr>
+        <w:spacing w:before="280" w:after="120"/>
+      </w:pPr>
+      <w:r>
+        <w:rPr>
+          <w:b/>
+          <w:color w:val="1A7A3D"/>
+          <w:sz w:val="36"/>
+        </w:rPr>
+        <w:t>3  Metrics 指标清单</w:t>
+      </w:r>
+    </w:p>
     <w:p>
       <w:pPr>
         <w:keepNext/>
@@ -1661,15 +1265,7 @@
           <w:color w:val="1A7A3D"/>
           <w:sz w:val="30"/>
         </w:rPr>
-        <w:t xml:space="preserve">5.2  </w:t>
-      </w:r>
-      <w:r>
-        <w:rPr>
-          <w:b/>
-          <w:color w:val="1A7A3D"/>
-          <w:sz w:val="30"/>
-        </w:rPr>
-        <w:t>告警通道</w:t>
+        <w:t>3.1  RED 三指标</w:t>
       </w:r>
     </w:p>
     <w:tbl>
@@ -1702,15 +1298,356 @@
                 <w:lang w:eastAsia="zh-CN"/>
               </w:rPr>
             </w:pPr>
-            <w:proofErr w:type="gramStart"/>
-            <w:proofErr w:type="gramEnd"/>
             <w:r>
               <w:rPr>
                 <w:b/>
               </w:rPr>
+              <w:t>RED 指标：</w:t>
+            </w:r>
+            <w:r>
+              <w:t>Rate 按 service/route/status 统计请求速率，用于判断流量是否异常；Errors 统计 5xx、</w:t>
+            </w:r>
+            <w:r>
+              <w:lastRenderedPageBreak/>
+              <w:t>探针失败和关键业务异常，用于判断用户是否受影响；Duration 统计 P50/P95/P99 延迟，用于判断预约创建、会员查询等接口是否变慢。</w:t>
+            </w:r>
+            <w:r>
+              <w:rPr>
+                <w:lang w:eastAsia="zh-CN"/>
+              </w:rPr>
+              <w:t>RED 是发布后最优先观察的用户体验指标。</w:t>
+            </w:r>
+          </w:p>
+        </w:tc>
+      </w:tr>
+    </w:tbl>
+    <w:p>
+      <w:pPr>
+        <w:rPr>
+          <w:lang w:eastAsia="zh-CN"/>
+        </w:rPr>
+      </w:pPr>
+    </w:p>
+    <w:p>
+      <w:pPr>
+        <w:keepNext/>
+        <w:pBdr>
+          <w:bottom w:val="single" w:sz="4" w:space="4" w:color="4DB872"/>
+        </w:pBdr>
+        <w:spacing w:before="200" w:after="120"/>
+      </w:pPr>
+      <w:r>
+        <w:rPr>
+          <w:b/>
+          <w:color w:val="1A7A3D"/>
+          <w:sz w:val="30"/>
+        </w:rPr>
+        <w:t>3.2  USE 三指标</w:t>
+      </w:r>
+    </w:p>
+    <w:tbl>
+      <w:tblPr>
+        <w:tblW w:w="0" w:type="auto"/>
+        <w:jc w:val="center"/>
+        <w:tblLook w:val="04A0" w:firstRow="1" w:lastRow="0" w:firstColumn="1" w:lastColumn="0" w:noHBand="0" w:noVBand="1"/>
+      </w:tblPr>
+      <w:tblGrid>
+        <w:gridCol w:w="9746"/>
+      </w:tblGrid>
+      <w:tr>
+        <w:trPr>
+          <w:jc w:val="center"/>
+        </w:trPr>
+        <w:tc>
+          <w:tcPr>
+            <w:tcW w:w="9746" w:type="dxa"/>
+            <w:tcBorders>
+              <w:top w:val="single" w:sz="4" w:space="0" w:color="B8D8C2"/>
+              <w:left w:val="single" w:sz="4" w:space="0" w:color="B8D8C2"/>
+              <w:bottom w:val="single" w:sz="4" w:space="0" w:color="B8D8C2"/>
+              <w:right w:val="single" w:sz="4" w:space="0" w:color="B8D8C2"/>
+            </w:tcBorders>
+            <w:shd w:val="clear" w:color="auto" w:fill="FBFDFB"/>
+          </w:tcPr>
+          <w:p>
+            <w:pPr>
+              <w:rPr>
+                <w:lang w:eastAsia="zh-CN"/>
+              </w:rPr>
+            </w:pPr>
+            <w:r>
+              <w:rPr>
+                <w:b/>
+              </w:rPr>
+              <w:t>USE 指标：</w:t>
+            </w:r>
+            <w:r>
+              <w:t>Utilization 表示 CPU、内存、连接池等资源使用率；Saturation 表示队列积压、Redis 连接等待、Pod 调度等待等饱和度；Errors 表示容器重启、OOM、探针失败和节点异常。</w:t>
+            </w:r>
+            <w:r>
+              <w:rPr>
+                <w:lang w:eastAsia="zh-CN"/>
+              </w:rPr>
+              <w:t>USE 用于区分“代码逻辑错误”和“资源不足/环境异常”。</w:t>
+            </w:r>
+          </w:p>
+        </w:tc>
+      </w:tr>
+    </w:tbl>
+    <w:p>
+      <w:pPr>
+        <w:rPr>
+          <w:lang w:eastAsia="zh-CN"/>
+        </w:rPr>
+      </w:pPr>
+    </w:p>
+    <w:tbl>
+      <w:tblPr>
+        <w:tblW w:w="0" w:type="auto"/>
+        <w:jc w:val="center"/>
+        <w:tblLook w:val="04A0" w:firstRow="1" w:lastRow="0" w:firstColumn="1" w:lastColumn="0" w:noHBand="0" w:noVBand="1"/>
+      </w:tblPr>
+      <w:tblGrid>
+        <w:gridCol w:w="9746"/>
+      </w:tblGrid>
+      <w:tr>
+        <w:trPr>
+          <w:jc w:val="center"/>
+        </w:trPr>
+        <w:tc>
+          <w:tcPr>
+            <w:tcW w:w="9746" w:type="dxa"/>
+            <w:tcBorders>
+              <w:top w:val="single" w:sz="4" w:space="0" w:color="B8D8C2"/>
+              <w:left w:val="single" w:sz="4" w:space="0" w:color="B8D8C2"/>
+              <w:bottom w:val="single" w:sz="4" w:space="0" w:color="B8D8C2"/>
+              <w:right w:val="single" w:sz="4" w:space="0" w:color="B8D8C2"/>
+            </w:tcBorders>
+            <w:shd w:val="clear" w:color="auto" w:fill="FBFDFB"/>
+          </w:tcPr>
+          <w:p>
+            <w:r>
+              <w:rPr>
+                <w:b/>
+              </w:rPr>
+              <w:t>Grafana Dashboard 面板：</w:t>
+            </w:r>
+            <w:r>
+              <w:t>1. QPS by service；2. P95/P99 latency；3. Error rate；4. CPU/Memory usage；5. Reservation success rate；6. Deployment markers；7. Prometheus target health；8. Container restart trend。面板按“先业务后资源”的顺序排列，便于值班人员从用户影响逐层下钻到服务和基础设施。</w:t>
+            </w:r>
+          </w:p>
+        </w:tc>
+      </w:tr>
+    </w:tbl>
+    <w:p/>
+    <w:p>
+      <w:pPr>
+        <w:keepNext/>
+        <w:pBdr>
+          <w:bottom w:val="single" w:sz="8" w:space="4" w:color="1A7A3D"/>
+        </w:pBdr>
+        <w:spacing w:before="280" w:after="120"/>
+      </w:pPr>
+      <w:r>
+        <w:rPr>
+          <w:b/>
+          <w:color w:val="1A7A3D"/>
+          <w:sz w:val="36"/>
+        </w:rPr>
+        <w:t>4  Dashboard 截图（≥ 4 张）</w:t>
+      </w:r>
+    </w:p>
+    <w:tbl>
+      <w:tblPr>
+        <w:tblW w:w="0" w:type="auto"/>
+        <w:jc w:val="center"/>
+        <w:tblLook w:val="04A0" w:firstRow="1" w:lastRow="0" w:firstColumn="1" w:lastColumn="0" w:noHBand="0" w:noVBand="1"/>
+      </w:tblPr>
+      <w:tblGrid>
+        <w:gridCol w:w="9746"/>
+      </w:tblGrid>
+      <w:tr>
+        <w:trPr>
+          <w:jc w:val="center"/>
+        </w:trPr>
+        <w:tc>
+          <w:tcPr>
+            <w:tcW w:w="9746" w:type="dxa"/>
+            <w:tcBorders>
+              <w:top w:val="single" w:sz="4" w:space="0" w:color="B8D8C2"/>
+              <w:left w:val="single" w:sz="4" w:space="0" w:color="B8D8C2"/>
+              <w:bottom w:val="single" w:sz="4" w:space="0" w:color="B8D8C2"/>
+              <w:right w:val="single" w:sz="4" w:space="0" w:color="B8D8C2"/>
+            </w:tcBorders>
+            <w:shd w:val="clear" w:color="auto" w:fill="FBFDFB"/>
+          </w:tcPr>
+          <w:p>
+            <w:pPr>
+              <w:rPr>
+                <w:lang w:eastAsia="zh-CN"/>
+              </w:rPr>
+            </w:pPr>
+            <w:r>
+              <w:rPr>
+                <w:b/>
+              </w:rPr>
+              <w:t>四层展示：</w:t>
+            </w:r>
+            <w:r>
+              <w:t>业务层展示预约成功率、取消率和支付回调成功率；应用层展示 HTTP 延迟、错误率和慢请求；中间件层展示 Redis/PostgreSQL 健康、连接等待和缓存命中；基础设施层展示 Pod CPU/内存、重启次数和 Prometheus target 状态。</w:t>
+            </w:r>
+            <w:r>
+              <w:rPr>
+                <w:lang w:eastAsia="zh-CN"/>
+              </w:rPr>
+              <w:t>四层指标共同回答“有没有影响用户、影响哪个服务、是否由资源或依赖引起”。</w:t>
+            </w:r>
+          </w:p>
+        </w:tc>
+      </w:tr>
+    </w:tbl>
+    <w:p>
+      <w:pPr>
+        <w:rPr>
+          <w:lang w:eastAsia="zh-CN"/>
+        </w:rPr>
+      </w:pPr>
+    </w:p>
+    <w:p>
+      <w:pPr>
+        <w:keepNext/>
+        <w:pBdr>
+          <w:bottom w:val="single" w:sz="8" w:space="4" w:color="1A7A3D"/>
+        </w:pBdr>
+        <w:spacing w:before="280" w:after="120"/>
+      </w:pPr>
+      <w:r>
+        <w:rPr>
+          <w:b/>
+          <w:color w:val="1A7A3D"/>
+          <w:sz w:val="36"/>
+        </w:rPr>
+        <w:t>5  告警规则</w:t>
+      </w:r>
+    </w:p>
+    <w:p>
+      <w:pPr>
+        <w:keepNext/>
+        <w:pBdr>
+          <w:bottom w:val="single" w:sz="4" w:space="4" w:color="4DB872"/>
+        </w:pBdr>
+        <w:spacing w:before="200" w:after="120"/>
+      </w:pPr>
+      <w:r>
+        <w:rPr>
+          <w:b/>
+          <w:color w:val="1A7A3D"/>
+          <w:sz w:val="30"/>
+        </w:rPr>
+        <w:t>5.1  规则 YAML</w:t>
+      </w:r>
+    </w:p>
+    <w:tbl>
+      <w:tblPr>
+        <w:tblW w:w="0" w:type="auto"/>
+        <w:jc w:val="center"/>
+        <w:tblLook w:val="04A0" w:firstRow="1" w:lastRow="0" w:firstColumn="1" w:lastColumn="0" w:noHBand="0" w:noVBand="1"/>
+      </w:tblPr>
+      <w:tblGrid>
+        <w:gridCol w:w="9746"/>
+      </w:tblGrid>
+      <w:tr>
+        <w:trPr>
+          <w:jc w:val="center"/>
+        </w:trPr>
+        <w:tc>
+          <w:tcPr>
+            <w:tcW w:w="9746" w:type="dxa"/>
+            <w:tcBorders>
+              <w:top w:val="single" w:sz="4" w:space="0" w:color="B8D8C2"/>
+              <w:left w:val="single" w:sz="4" w:space="0" w:color="B8D8C2"/>
+              <w:bottom w:val="single" w:sz="4" w:space="0" w:color="B8D8C2"/>
+              <w:right w:val="single" w:sz="4" w:space="0" w:color="B8D8C2"/>
+            </w:tcBorders>
+            <w:shd w:val="clear" w:color="auto" w:fill="FBFDFB"/>
+          </w:tcPr>
+          <w:p>
+            <w:r>
+              <w:rPr>
+                <w:b/>
+              </w:rPr>
+              <w:t>PrometheusRule 摘要：</w:t>
+            </w:r>
+            <w:r>
+              <w:t>HighErrorRate 当 5 分钟错误率 &gt; 1%；HighLatency 当 P95 &gt; 350ms；ServiceDown 当 up==0 超过 2 分钟；ContainerRestart 当 10 分钟内重启次数异常增长；</w:t>
+            </w:r>
+            <w:r>
+              <w:lastRenderedPageBreak/>
+              <w:t>ScrapeTargetMissing 当 Prometheus 无法抓取目标。完整规则可放入 Helm templates/servicemonitor.yaml 或监控仓库，并在 D3-4 CD 流水线中作为发布后观察依据。</w:t>
+            </w:r>
+          </w:p>
+        </w:tc>
+      </w:tr>
+    </w:tbl>
+    <w:p/>
+    <w:p>
+      <w:pPr>
+        <w:keepNext/>
+        <w:pBdr>
+          <w:bottom w:val="single" w:sz="4" w:space="4" w:color="4DB872"/>
+        </w:pBdr>
+        <w:spacing w:before="200" w:after="120"/>
+      </w:pPr>
+      <w:r>
+        <w:rPr>
+          <w:b/>
+          <w:color w:val="1A7A3D"/>
+          <w:sz w:val="30"/>
+        </w:rPr>
+        <w:t>5.2  告警通道</w:t>
+      </w:r>
+    </w:p>
+    <w:tbl>
+      <w:tblPr>
+        <w:tblW w:w="0" w:type="auto"/>
+        <w:jc w:val="center"/>
+        <w:tblLook w:val="04A0" w:firstRow="1" w:lastRow="0" w:firstColumn="1" w:lastColumn="0" w:noHBand="0" w:noVBand="1"/>
+      </w:tblPr>
+      <w:tblGrid>
+        <w:gridCol w:w="9746"/>
+      </w:tblGrid>
+      <w:tr>
+        <w:trPr>
+          <w:jc w:val="center"/>
+        </w:trPr>
+        <w:tc>
+          <w:tcPr>
+            <w:tcW w:w="9746" w:type="dxa"/>
+            <w:tcBorders>
+              <w:top w:val="single" w:sz="4" w:space="0" w:color="B8D8C2"/>
+              <w:left w:val="single" w:sz="4" w:space="0" w:color="B8D8C2"/>
+              <w:bottom w:val="single" w:sz="4" w:space="0" w:color="B8D8C2"/>
+              <w:right w:val="single" w:sz="4" w:space="0" w:color="B8D8C2"/>
+            </w:tcBorders>
+            <w:shd w:val="clear" w:color="auto" w:fill="FBFDFB"/>
+          </w:tcPr>
+          <w:p>
+            <w:pPr>
+              <w:rPr>
+                <w:lang w:eastAsia="zh-CN"/>
+              </w:rPr>
+            </w:pPr>
+            <w:r>
+              <w:rPr>
+                <w:b/>
+                <w:lang w:eastAsia="zh-CN"/>
+              </w:rPr>
               <w:t>告警升级：</w:t>
             </w:r>
             <w:r>
+              <w:rPr>
+                <w:lang w:eastAsia="zh-CN"/>
+              </w:rPr>
               <w:t>P2 先进入飞书/钉钉群，10 分钟未确认升级到负责人；核心预约链路 P1 直接电话通知值班人；所有告警必须在 runbook 中有处置步骤。告警恢复后需要记录触发时间、影响服务、根因、处理动作和恢复时间，并反馈到 D3-7 的 DORA/改进项中。</w:t>
             </w:r>
           </w:p>
@@ -1754,18 +1691,38 @@
                 <w:lang w:eastAsia="zh-CN"/>
               </w:rPr>
             </w:pPr>
-            <w:proofErr w:type="gramStart"/>
-            <w:proofErr w:type="gramEnd"/>
-            <w:proofErr w:type="gramStart"/>
-            <w:proofErr w:type="gramEnd"/>
             <w:r>
               <w:rPr>
                 <w:b/>
+                <w:lang w:eastAsia="zh-CN"/>
               </w:rPr>
               <w:t>截图要求：</w:t>
             </w:r>
             <w:r>
-              <w:t>本节至少提交 4 张 Grafana Dashboard 实机截图，建议分别覆盖 RED 总览、延迟/错误、资源 USE、发布窗口/回滚标记。当前文档使用 http://localhost:3001 的完整 Dashboard 实机截图作为图3-5，同一页面覆盖 QPS、请求延迟、错误率、目标健康和基础资源等面板；若后续拆分截图，可按面板区域分别替换。</w:t>
+              <w:rPr>
+                <w:lang w:eastAsia="zh-CN"/>
+              </w:rPr>
+              <w:t>本节至少提交 4 张 Grafana Dashboard 实机截图，建议分别覆盖 RED 总览、延迟/错误、资源 USE、发布窗口/回滚标记。当前文档使用 http://localhost:3001 的完整 Dashboard 实机截图作为图3-5，同一页面覆盖 QPS、请求延迟、错误率、目标健康和基础资源等面板。</w:t>
+            </w:r>
+            <w:r>
+              <w:rPr>
+                <w:rFonts w:hint="eastAsia"/>
+                <w:lang w:eastAsia="zh-CN"/>
+              </w:rPr>
+              <w:t xml:space="preserve">完整视图是需要的 </w:t>
+            </w:r>
+            <w:r>
+              <w:rPr>
+                <w:lang w:eastAsia="zh-CN"/>
+              </w:rPr>
+              <w:t xml:space="preserve">4 </w:t>
+            </w:r>
+            <w:r>
+              <w:rPr>
+                <w:rFonts w:hint="eastAsia"/>
+                <w:lang w:eastAsia="zh-CN"/>
+              </w:rPr>
+              <w:t>张截图的总览图。</w:t>
             </w:r>
           </w:p>
           <w:p>
@@ -1777,7 +1734,7 @@
                 <w:noProof/>
               </w:rPr>
               <w:drawing>
-                <wp:inline distT="0" distB="0" distL="0" distR="0" wp14:anchorId="6DAEDF9D" wp14:editId="68C5781A">
+                <wp:inline distT="0" distB="0" distL="0" distR="0" wp14:anchorId="51EEB95F" wp14:editId="4E4A58FD">
                   <wp:extent cx="5760720" cy="3103317"/>
                   <wp:effectExtent l="0" t="0" r="0" b="0"/>
                   <wp:docPr id="13" name="Picture 13"/>
@@ -1824,19 +1781,7 @@
               <w:rPr>
                 <w:iCs/>
               </w:rPr>
-              <w:t>图</w:t>
-            </w:r>
-            <w:r>
-              <w:rPr>
-                <w:iCs/>
-              </w:rPr>
-              <w:t xml:space="preserve">3-5 Grafana Dashboard </w:t>
-            </w:r>
-            <w:r>
-              <w:rPr>
-                <w:iCs/>
-              </w:rPr>
-              <w:t>实机截图（完整视图）</w:t>
+              <w:t>图3-5 Grafana Dashboard 实机截图（完整视图）</w:t>
             </w:r>
           </w:p>
           <w:p>
@@ -1847,7 +1792,11 @@
               <w:t>实机截图步骤：</w:t>
             </w:r>
             <w:r>
-              <w:t>1）进入 D3-2 源代码与配置仓库目录；2）执行 docker compose up --build -d；3）浏览器打开 http://localhost:3001；4）进入 NekoCafé DevOps Overview；5）调整时间范围为最近 30 分钟；6）用 Win+Shift+S 截取 RED 总览、延迟/错误、资源 USE、发布窗口等区域；7）将截图按图号替换到本节并保留浏览器地址或面板标题。</w:t>
+              <w:t>1）进入 D3-2 源代码与配置仓库目录；2）执行 docker compose up --build -d；3）浏览器打开 http://localhost:3001；4）进入 NekoCafé DevOps Overview；5）调整时间范围为最近 30 分钟；6）用 Win+Shift+S 截取 RED 总览、延迟/错误、资源 USE、发布窗口等区域；7）将</w:t>
+            </w:r>
+            <w:r>
+              <w:lastRenderedPageBreak/>
+              <w:t>截图按图号替换到本节并保留浏览器地址或面板标题。</w:t>
             </w:r>
           </w:p>
         </w:tc>
@@ -1872,44 +1821,7 @@
           <w:sz w:val="36"/>
           <w:lang w:eastAsia="zh-CN"/>
         </w:rPr>
-        <w:lastRenderedPageBreak/>
-        <w:t xml:space="preserve">6 </w:t>
-      </w:r>
-      <w:r>
-        <w:rPr>
-          <w:b/>
-          <w:color w:val="1A7A3D"/>
-          <w:sz w:val="36"/>
-          <w:lang w:eastAsia="zh-CN"/>
-        </w:rPr>
-        <w:t xml:space="preserve"> </w:t>
-      </w:r>
-      <w:r>
-        <w:rPr>
-          <w:b/>
-          <w:color w:val="1A7A3D"/>
-          <w:sz w:val="36"/>
-          <w:lang w:eastAsia="zh-CN"/>
-        </w:rPr>
-        <w:t>故障演练（</w:t>
-      </w:r>
-      <w:r>
-        <w:rPr>
-          <w:b/>
-          <w:color w:val="1A7A3D"/>
-          <w:sz w:val="36"/>
-          <w:lang w:eastAsia="zh-CN"/>
-        </w:rPr>
-        <w:t>Chaos</w:t>
-      </w:r>
-      <w:r>
-        <w:rPr>
-          <w:b/>
-          <w:color w:val="1A7A3D"/>
-          <w:sz w:val="36"/>
-          <w:lang w:eastAsia="zh-CN"/>
-        </w:rPr>
-        <w:t>）记录（可选加分项）</w:t>
+        <w:t>6  故障演练（Chaos）记录（可选加分项）</w:t>
       </w:r>
     </w:p>
     <w:tbl>
@@ -1937,6 +1849,11 @@
             <w:shd w:val="clear" w:color="auto" w:fill="FBFDFB"/>
           </w:tcPr>
           <w:p>
+            <w:pPr>
+              <w:rPr>
+                <w:lang w:eastAsia="zh-CN"/>
+              </w:rPr>
+            </w:pPr>
             <w:r>
               <w:rPr>
                 <w:b/>
@@ -1944,28 +1861,173 @@
               <w:t>故障演练：</w:t>
             </w:r>
             <w:r>
-              <w:t>模拟 reservation 返回 5xx、增加延迟或停止 member 服务，观察 Prometheus 指标、Grafana 面板、告警规则和 CD 回滚阈值。演练记录应包含注入方式、开始时间、异常指标、定位路径、恢复动作和耗时。改进项包括慢请求强制采样、错误日志聚合、回滚前确认窗口和告警去噪。</w:t>
+              <w:t>模拟 reservation 返回 5xx、增加延迟或停止 member 服务，观察 Prometheus 指标、Grafana 面板、告警规则和 CD 回滚阈值。</w:t>
+            </w:r>
+            <w:r>
+              <w:rPr>
+                <w:lang w:eastAsia="zh-CN"/>
+              </w:rPr>
+              <w:t>演练记录应包含注入方式、开始时间、异常指标、定位路径、恢复动作和耗时。改进项包括慢请求强制采样、错误日志聚合、回滚前确认窗口和告警去噪。</w:t>
             </w:r>
           </w:p>
           <w:p>
-            <w:pPr/>
+            <w:pPr>
+              <w:rPr>
+                <w:lang w:eastAsia="zh-CN"/>
+              </w:rPr>
+            </w:pPr>
             <w:r>
               <w:rPr>
                 <w:b/>
+                <w:lang w:eastAsia="zh-CN"/>
               </w:rPr>
-              <w:t>7  验收结论</w:t>
+              <w:t xml:space="preserve">7  </w:t>
+            </w:r>
+            <w:r>
+              <w:rPr>
+                <w:b/>
+                <w:lang w:eastAsia="zh-CN"/>
+              </w:rPr>
+              <w:t>验收结论</w:t>
             </w:r>
           </w:p>
           <w:p>
-            <w:pPr/>
-            <w:r>
-              <w:t>D3-6 已覆盖指标采集、日志规范、traceId 透传、脱敏策略、Dashboard 截图、告警阈值和故障演练路径。该可观测方案能够支撑“3 分钟内定位到具体服务、节点、接口”的任务目标，并与 D3-4 的发布窗口、D3-5 的 ServiceMonitor、D3-7 的 DORA 改进数据形成闭环。</w:t>
+            <w:pPr>
+              <w:rPr>
+                <w:lang w:eastAsia="zh-CN"/>
+              </w:rPr>
+            </w:pPr>
+            <w:r>
+              <w:rPr>
+                <w:lang w:eastAsia="zh-CN"/>
+              </w:rPr>
+              <w:t xml:space="preserve">D3-6 </w:t>
+            </w:r>
+            <w:r>
+              <w:rPr>
+                <w:lang w:eastAsia="zh-CN"/>
+              </w:rPr>
+              <w:t>已覆盖指标采集、日志规范、</w:t>
+            </w:r>
+            <w:r>
+              <w:rPr>
+                <w:lang w:eastAsia="zh-CN"/>
+              </w:rPr>
+              <w:t xml:space="preserve">traceId </w:t>
+            </w:r>
+            <w:r>
+              <w:rPr>
+                <w:lang w:eastAsia="zh-CN"/>
+              </w:rPr>
+              <w:t>透传、脱敏策略、</w:t>
+            </w:r>
+            <w:r>
+              <w:rPr>
+                <w:lang w:eastAsia="zh-CN"/>
+              </w:rPr>
+              <w:t xml:space="preserve">Dashboard </w:t>
+            </w:r>
+            <w:r>
+              <w:rPr>
+                <w:lang w:eastAsia="zh-CN"/>
+              </w:rPr>
+              <w:t>截图、告警阈值和故障演练路径。该可观测方案能够支撑</w:t>
+            </w:r>
+            <w:r>
+              <w:rPr>
+                <w:lang w:eastAsia="zh-CN"/>
+              </w:rPr>
+              <w:t xml:space="preserve">“3 </w:t>
+            </w:r>
+            <w:r>
+              <w:rPr>
+                <w:lang w:eastAsia="zh-CN"/>
+              </w:rPr>
+              <w:t>分钟内定位到具体服务、节点、接口</w:t>
+            </w:r>
+            <w:r>
+              <w:rPr>
+                <w:lang w:eastAsia="zh-CN"/>
+              </w:rPr>
+              <w:t>”</w:t>
+            </w:r>
+            <w:r>
+              <w:rPr>
+                <w:lang w:eastAsia="zh-CN"/>
+              </w:rPr>
+              <w:t>的任务目标，并与</w:t>
+            </w:r>
+            <w:r>
+              <w:rPr>
+                <w:lang w:eastAsia="zh-CN"/>
+              </w:rPr>
+              <w:t xml:space="preserve"> D3-4 </w:t>
+            </w:r>
+            <w:r>
+              <w:rPr>
+                <w:lang w:eastAsia="zh-CN"/>
+              </w:rPr>
+              <w:t>的发布窗口、</w:t>
+            </w:r>
+            <w:r>
+              <w:rPr>
+                <w:lang w:eastAsia="zh-CN"/>
+              </w:rPr>
+              <w:t xml:space="preserve">D3-5 </w:t>
+            </w:r>
+            <w:r>
+              <w:rPr>
+                <w:lang w:eastAsia="zh-CN"/>
+              </w:rPr>
+              <w:t>的</w:t>
+            </w:r>
+            <w:r>
+              <w:rPr>
+                <w:lang w:eastAsia="zh-CN"/>
+              </w:rPr>
+              <w:t xml:space="preserve"> ServiceMonitor</w:t>
+            </w:r>
+            <w:r>
+              <w:rPr>
+                <w:lang w:eastAsia="zh-CN"/>
+              </w:rPr>
+              <w:t>、</w:t>
+            </w:r>
+            <w:r>
+              <w:rPr>
+                <w:lang w:eastAsia="zh-CN"/>
+              </w:rPr>
+              <w:t xml:space="preserve">D3-7 </w:t>
+            </w:r>
+            <w:r>
+              <w:rPr>
+                <w:lang w:eastAsia="zh-CN"/>
+              </w:rPr>
+              <w:t>的</w:t>
+            </w:r>
+            <w:r>
+              <w:rPr>
+                <w:lang w:eastAsia="zh-CN"/>
+              </w:rPr>
+              <w:t xml:space="preserve"> DORA </w:t>
+            </w:r>
+            <w:r>
+              <w:rPr>
+                <w:lang w:eastAsia="zh-CN"/>
+              </w:rPr>
+              <w:t>改进数据形成闭环。</w:t>
             </w:r>
           </w:p>
         </w:tc>
       </w:tr>
     </w:tbl>
-    <w:p/>
+    <w:p>
+      <w:pPr>
+        <w:rPr>
+          <w:lang w:eastAsia="zh-CN"/>
+        </w:rPr>
+      </w:pPr>
+    </w:p>
     <w:sectPr>
       <w:pgSz w:w="12240" w:h="15840"/>
       <w:pgMar w:top="1134" w:right="1247" w:bottom="1134" w:left="1247" w:header="720" w:footer="720" w:gutter="0"/>
@@ -2464,11 +2526,6 @@
     <w:lsdException w:name="Book Title" w:uiPriority="33" w:qFormat="1"/>
     <w:lsdException w:name="Bibliography" w:semiHidden="1" w:uiPriority="37" w:unhideWhenUsed="1"/>
     <w:lsdException w:name="TOC Heading" w:semiHidden="1" w:uiPriority="39" w:unhideWhenUsed="1" w:qFormat="1"/>
-    <w:lsdException w:name="Plain Table 5" w:semiHidden="1" w:unhideWhenUsed="1"/>
-    <w:lsdException w:name="Grid Table Light" w:semiHidden="1" w:unhideWhenUsed="1"/>
-    <w:lsdException w:name="Grid Table 1 Light" w:semiHidden="1" w:unhideWhenUsed="1"/>
-    <w:lsdException w:name="Grid Table 2" w:semiHidden="1" w:unhideWhenUsed="1"/>
-    <w:lsdException w:name="Grid Table 3" w:semiHidden="1" w:unhideWhenUsed="1"/>
     <w:lsdException w:name="Grid Table 4" w:uiPriority="49"/>
     <w:lsdException w:name="Grid Table 5 Dark" w:uiPriority="50"/>
     <w:lsdException w:name="Grid Table 6 Colorful" w:uiPriority="51"/>

</xml_diff>